<commit_message>
ajout de la charte graphique
</commit_message>
<xml_diff>
--- a/Documentation/Charte graphique FISCHER-NOTAR.docx
+++ b/Documentation/Charte graphique FISCHER-NOTAR.docx
@@ -155,6 +155,9 @@
         <w:t xml:space="preserve">Navy : </w:t>
       </w:r>
       <w:r>
+        <w:t>#</w:t>
+      </w:r>
+      <w:r>
         <w:t>000080</w:t>
       </w:r>
     </w:p>
@@ -182,18 +185,10 @@
         <w:pStyle w:val="Studys"/>
       </w:pPr>
       <w:r>
-        <w:t>Police</w:t>
-      </w:r>
-      <w:proofErr w:type="gramStart"/>
-      <w:r>
-        <w:t> :</w:t>
-      </w:r>
-      <w:r>
-        <w:t>Open</w:t>
-      </w:r>
-      <w:proofErr w:type="gramEnd"/>
-      <w:r>
-        <w:t xml:space="preserve"> sans</w:t>
+        <w:t>Police :</w:t>
+      </w:r>
+      <w:r>
+        <w:t>Open sans</w:t>
       </w:r>
       <w:r>
         <w:t> </w:t>
@@ -829,7 +824,6 @@
     <w:uiPriority w:val="1"/>
     <w:semiHidden/>
     <w:unhideWhenUsed/>
-    <w:rsid w:val="00672784"/>
   </w:style>
   <w:style w:type="table" w:default="1" w:styleId="TableauNormal">
     <w:name w:val="Normal Table"/>
@@ -851,7 +845,6 @@
     <w:uiPriority w:val="99"/>
     <w:semiHidden/>
     <w:unhideWhenUsed/>
-    <w:rsid w:val="00672784"/>
   </w:style>
   <w:style w:type="character" w:customStyle="1" w:styleId="Titre1Car">
     <w:name w:val="Titre 1 Car"/>

</xml_diff>

<commit_message>
Changement dans les dates, amélioration de de la charte graphique
</commit_message>
<xml_diff>
--- a/Documentation/Charte graphique FISCHER-NOTAR.docx
+++ b/Documentation/Charte graphique FISCHER-NOTAR.docx
@@ -22,66 +22,10 @@
     <w:p>
       <w:pPr>
         <w:pStyle w:val="Studys"/>
-      </w:pPr>
-      <w:r>
-        <w:t>Ce document est la référence graphique pour le portfolio FISCHER-NOTAR Ylian</w:t>
-      </w:r>
-    </w:p>
-    <w:p>
-      <w:pPr>
-        <w:pStyle w:val="Studys"/>
-      </w:pPr>
-      <w:r>
-        <w:t>2.</w:t>
-      </w:r>
-      <w:r>
-        <w:t xml:space="preserve"> </w:t>
-      </w:r>
-      <w:r>
-        <w:t>Objectif visuel du portfolio</w:t>
-      </w:r>
-    </w:p>
-    <w:p>
-      <w:pPr>
-        <w:pStyle w:val="Studys"/>
-      </w:pPr>
-      <w:r>
-        <w:t xml:space="preserve">L’objectif visuel du portfolio est de se </w:t>
-      </w:r>
-      <w:r>
-        <w:t>démarquer</w:t>
-      </w:r>
-      <w:r>
-        <w:t xml:space="preserve"> tous en restant professionnel et modern</w:t>
-      </w:r>
-    </w:p>
-    <w:p>
-      <w:pPr>
-        <w:pStyle w:val="Studys"/>
-      </w:pPr>
-      <w:r>
-        <w:t xml:space="preserve">3. Logo </w:t>
-      </w:r>
-    </w:p>
-    <w:p>
-      <w:pPr>
-        <w:pStyle w:val="Studys"/>
-      </w:pPr>
-      <w:r>
-        <w:t xml:space="preserve">A faire </w:t>
-      </w:r>
-    </w:p>
-    <w:p>
-      <w:pPr>
-        <w:pStyle w:val="Studys"/>
-      </w:pPr>
-      <w:r>
-        <w:t xml:space="preserve">4. Palette de couleurs </w:t>
-      </w:r>
-    </w:p>
-    <w:p>
-      <w:pPr>
-        <w:pStyle w:val="Studys"/>
+        <w:numPr>
+          <w:ilvl w:val="0"/>
+          <w:numId w:val="1"/>
+        </w:numPr>
         <w:rPr>
           <w:i/>
           <w:iCs/>
@@ -92,81 +36,423 @@
           <w:i/>
           <w:iCs/>
         </w:rPr>
-        <w:t>Mode clair</w:t>
-      </w:r>
-      <w:r>
+        <w:t>Présentation du projet</w:t>
+      </w:r>
+    </w:p>
+    <w:p>
+      <w:pPr>
+        <w:pStyle w:val="Studys"/>
+      </w:pPr>
+      <w:r>
+        <w:t>Cette charte graphique définit m’identité visuelle de mon portfolio professionnel réalisé dans le cadre de l’épreuve U5 de mon BTS SIO</w:t>
+      </w:r>
+    </w:p>
+    <w:p>
+      <w:pPr>
+        <w:pStyle w:val="Studys"/>
+        <w:numPr>
+          <w:ilvl w:val="0"/>
+          <w:numId w:val="1"/>
+        </w:numPr>
         <w:rPr>
           <w:i/>
           <w:iCs/>
         </w:rPr>
-        <w:t> :</w:t>
-      </w:r>
-    </w:p>
-    <w:p>
-      <w:pPr>
-        <w:pStyle w:val="Studys"/>
-      </w:pPr>
-      <w:r>
-        <w:t xml:space="preserve">Bleu : </w:t>
-      </w:r>
-      <w:r>
-        <w:t>0D53FF</w:t>
-      </w:r>
-    </w:p>
-    <w:p>
-      <w:pPr>
-        <w:pStyle w:val="Studys"/>
-      </w:pPr>
-      <w:r>
-        <w:t xml:space="preserve">Blanc : </w:t>
-      </w:r>
-      <w:r>
-        <w:t>FFFFFF</w:t>
-      </w:r>
-    </w:p>
-    <w:p>
-      <w:pPr>
-        <w:pStyle w:val="Studys"/>
+      </w:pPr>
+      <w:r>
         <w:rPr>
           <w:i/>
           <w:iCs/>
         </w:rPr>
-      </w:pPr>
-      <w:r>
+        <w:t>Objectif visuel du portfolio</w:t>
+      </w:r>
+    </w:p>
+    <w:p>
+      <w:pPr>
+        <w:pStyle w:val="Studys"/>
+      </w:pPr>
+      <w:r>
+        <w:t xml:space="preserve">Ce projet a pour objectif de présenté de mon parcours, mes compétences, mes projets réalisés et mes expériences professionnelles. Il doit refléter une image sérieuse, moderne et professionnelle afin de </w:t>
+      </w:r>
+      <w:r>
+        <w:t>valoriser</w:t>
+      </w:r>
+      <w:r>
+        <w:t xml:space="preserve"> mon profil au près des recruteurs </w:t>
+      </w:r>
+      <w:r>
+        <w:t xml:space="preserve"> </w:t>
+      </w:r>
+    </w:p>
+    <w:p>
+      <w:pPr>
+        <w:pStyle w:val="Studys"/>
+      </w:pPr>
+      <w:r>
+        <w:t xml:space="preserve">L’objectif visuel principal est de se démarquer des portfolios classiques tout en conservant une apparence professionnelle </w:t>
+      </w:r>
+    </w:p>
+    <w:p>
+      <w:pPr>
+        <w:pStyle w:val="Studys"/>
+        <w:numPr>
+          <w:ilvl w:val="0"/>
+          <w:numId w:val="1"/>
+        </w:numPr>
         <w:rPr>
           <w:i/>
           <w:iCs/>
         </w:rPr>
-        <w:t>Mode sombre :</w:t>
-      </w:r>
+      </w:pPr>
       <w:r>
         <w:rPr>
           <w:i/>
           <w:iCs/>
         </w:rPr>
+        <w:t>Identité graphique</w:t>
+      </w:r>
+    </w:p>
+    <w:p>
+      <w:pPr>
+        <w:pStyle w:val="Studys"/>
+      </w:pPr>
+      <w:r>
+        <w:t>Le design du site sera moderne, structuré, facile à lire</w:t>
+      </w:r>
+      <w:r>
+        <w:t>. Il</w:t>
+      </w:r>
+      <w:r>
+        <w:t xml:space="preserve"> devra être responsive</w:t>
+      </w:r>
+      <w:r>
+        <w:t>, c’est-à-dire s’adapter aux différentes tailles d’écran : ordinateurs tablettes et smartphones</w:t>
+      </w:r>
+    </w:p>
+    <w:p>
+      <w:pPr>
+        <w:pStyle w:val="Studys"/>
+      </w:pPr>
+      <w:r>
+        <w:t>L’ensemble des éléments graphiques devra respecter une cohérence visuelle afin de garantir une expérience utilisateur agréable</w:t>
+      </w:r>
+    </w:p>
+    <w:p>
+      <w:pPr>
+        <w:pStyle w:val="Studys"/>
+        <w:spacing w:line="360" w:lineRule="auto"/>
+      </w:pPr>
+      <w:r>
+        <w:t>4</w:t>
+      </w:r>
+      <w:r>
+        <w:t>.</w:t>
+      </w:r>
+      <w:r>
+        <w:rPr>
+          <w:i/>
+          <w:iCs/>
+        </w:rPr>
         <w:t xml:space="preserve"> </w:t>
       </w:r>
-    </w:p>
-    <w:p>
-      <w:pPr>
-        <w:pStyle w:val="Studys"/>
-      </w:pPr>
-      <w:r>
-        <w:t xml:space="preserve">Navy : </w:t>
-      </w:r>
-      <w:r>
-        <w:t>#</w:t>
-      </w:r>
-      <w:r>
-        <w:t>000080</w:t>
-      </w:r>
-    </w:p>
-    <w:p>
-      <w:pPr>
-        <w:pStyle w:val="Studys"/>
-      </w:pPr>
-      <w:r>
-        <w:t xml:space="preserve">Noir : </w:t>
+      <w:r>
+        <w:rPr>
+          <w:i/>
+          <w:iCs/>
+        </w:rPr>
+        <w:t>Logo</w:t>
+      </w:r>
+      <w:r>
+        <w:t xml:space="preserve"> </w:t>
+      </w:r>
+    </w:p>
+    <w:p>
+      <w:pPr>
+        <w:pStyle w:val="Studys"/>
+      </w:pPr>
+      <w:r>
+        <w:t xml:space="preserve">Le logo </w:t>
+      </w:r>
+      <w:r>
+        <w:t>représentera</w:t>
+      </w:r>
+      <w:r>
+        <w:t xml:space="preserve"> mon identité </w:t>
+      </w:r>
+      <w:r>
+        <w:t xml:space="preserve">au sein du </w:t>
+      </w:r>
+      <w:r>
+        <w:t>portfolio</w:t>
+      </w:r>
+    </w:p>
+    <w:p>
+      <w:pPr>
+        <w:pStyle w:val="Studys"/>
+      </w:pPr>
+      <w:r>
+        <w:lastRenderedPageBreak/>
+        <w:t xml:space="preserve">Composition : </w:t>
+      </w:r>
+    </w:p>
+    <w:p>
+      <w:pPr>
+        <w:pStyle w:val="Studys"/>
+      </w:pPr>
+      <w:r>
+        <w:t>Le logo sera constitué de mes initiales YFN</w:t>
+      </w:r>
+      <w:r>
+        <w:t xml:space="preserve"> correspondant à</w:t>
+      </w:r>
+      <w:r>
+        <w:t xml:space="preserve"> Ylian FISCHER-NOTAR</w:t>
+      </w:r>
+    </w:p>
+    <w:p>
+      <w:pPr>
+        <w:pStyle w:val="Studys"/>
+      </w:pPr>
+      <w:r>
+        <w:t>U</w:t>
+      </w:r>
+      <w:r>
+        <w:t xml:space="preserve">n symbole évoquant </w:t>
+      </w:r>
+      <w:proofErr w:type="gramStart"/>
+      <w:r>
+        <w:t>l</w:t>
+      </w:r>
+      <w:r>
+        <w:t>es technologies numérique</w:t>
+      </w:r>
+      <w:proofErr w:type="gramEnd"/>
+      <w:r>
+        <w:t xml:space="preserve"> </w:t>
+      </w:r>
+      <w:r>
+        <w:t xml:space="preserve">ou le réseau </w:t>
+      </w:r>
+    </w:p>
+    <w:p>
+      <w:pPr>
+        <w:pStyle w:val="Studys"/>
+      </w:pPr>
+      <w:r>
+        <w:t>U</w:t>
+      </w:r>
+      <w:r>
+        <w:t>ne couleur bleu dominante</w:t>
+      </w:r>
+      <w:r>
+        <w:t xml:space="preserve"> en cohérence avec la palette graphique du site</w:t>
+      </w:r>
+    </w:p>
+    <w:p>
+      <w:pPr>
+        <w:pStyle w:val="Studys"/>
+      </w:pPr>
+      <w:r>
+        <w:t>L’utilisation des initiales permet une reconnaissance rapide d</w:t>
+      </w:r>
+      <w:r>
+        <w:t>e mon</w:t>
+      </w:r>
+      <w:r>
+        <w:t xml:space="preserve"> portfolio.</w:t>
+      </w:r>
+    </w:p>
+    <w:p>
+      <w:pPr>
+        <w:pStyle w:val="Studys"/>
+      </w:pPr>
+      <w:r>
+        <w:t>Le symbole</w:t>
+      </w:r>
+      <w:r>
+        <w:t xml:space="preserve"> en lien avec l’informatique</w:t>
+      </w:r>
+      <w:r>
+        <w:t xml:space="preserve"> </w:t>
+      </w:r>
+      <w:r>
+        <w:t>permettra</w:t>
+      </w:r>
+      <w:r>
+        <w:t xml:space="preserve"> </w:t>
+      </w:r>
+      <w:r>
+        <w:t xml:space="preserve">une reconnaissance rapide de </w:t>
+      </w:r>
+      <w:r>
+        <w:t>mon domaine d’études.</w:t>
+      </w:r>
+    </w:p>
+    <w:p>
+      <w:pPr>
+        <w:pStyle w:val="Studys"/>
+        <w:numPr>
+          <w:ilvl w:val="0"/>
+          <w:numId w:val="2"/>
+        </w:numPr>
+        <w:rPr>
+          <w:i/>
+          <w:iCs/>
+        </w:rPr>
+      </w:pPr>
+      <w:r>
+        <w:rPr>
+          <w:i/>
+          <w:iCs/>
+        </w:rPr>
+        <w:t xml:space="preserve">Palette de couleurs </w:t>
+      </w:r>
+    </w:p>
+    <w:p>
+      <w:pPr>
+        <w:pStyle w:val="Studys"/>
+        <w:ind w:left="360"/>
+      </w:pPr>
+      <w:r>
+        <w:t xml:space="preserve">Afin d’améliorer l’expérience </w:t>
+      </w:r>
+      <w:r>
+        <w:t>utilisateur, le site disposera d’un mode sombre et d’un mode clair. Les couleurs sont les suivant</w:t>
+      </w:r>
+    </w:p>
+    <w:p>
+      <w:pPr>
+        <w:pStyle w:val="Studys"/>
+        <w:rPr>
+          <w:i/>
+          <w:iCs/>
+        </w:rPr>
+      </w:pPr>
+      <w:r>
+        <w:rPr>
+          <w:i/>
+          <w:iCs/>
+        </w:rPr>
+        <w:t>Mode clair</w:t>
+      </w:r>
+      <w:r>
+        <w:rPr>
+          <w:i/>
+          <w:iCs/>
+        </w:rPr>
+        <w:t> :</w:t>
+      </w:r>
+    </w:p>
+    <w:p>
+      <w:pPr>
+        <w:pStyle w:val="Studys"/>
+      </w:pPr>
+      <w:r>
+        <w:rPr>
+          <w:color w:val="0D53FF"/>
+        </w:rPr>
+        <w:t>Bleu</w:t>
+      </w:r>
+      <w:r>
+        <w:rPr>
+          <w:color w:val="EE0000"/>
+        </w:rPr>
+        <w:t> </w:t>
+      </w:r>
+      <w:r>
+        <w:t xml:space="preserve">: </w:t>
+      </w:r>
+      <w:r>
+        <w:t>0D53FF</w:t>
+      </w:r>
+    </w:p>
+    <w:p>
+      <w:pPr>
+        <w:pStyle w:val="Studys"/>
+      </w:pPr>
+      <w:r>
+        <w:t xml:space="preserve">Blanc : </w:t>
+      </w:r>
+      <w:r>
+        <w:t>FFFFFF</w:t>
+      </w:r>
+    </w:p>
+    <w:p>
+      <w:pPr>
+        <w:pStyle w:val="Studys"/>
+        <w:rPr>
+          <w:i/>
+          <w:iCs/>
+        </w:rPr>
+      </w:pPr>
+      <w:r>
+        <w:rPr>
+          <w:i/>
+          <w:iCs/>
+        </w:rPr>
+        <w:t>Mode sombre :</w:t>
+      </w:r>
+      <w:r>
+        <w:rPr>
+          <w:i/>
+          <w:iCs/>
+        </w:rPr>
+        <w:t xml:space="preserve"> </w:t>
+      </w:r>
+    </w:p>
+    <w:p>
+      <w:pPr>
+        <w:pStyle w:val="Studys"/>
+      </w:pPr>
+      <w:r>
+        <w:rPr>
+          <w:color w:val="CCD9F0"/>
+        </w:rPr>
+        <w:t>Bleu</w:t>
+      </w:r>
+      <w:r>
+        <w:rPr>
+          <w:color w:val="CCD9F0"/>
+        </w:rPr>
+        <w:t xml:space="preserve"> gris</w:t>
+      </w:r>
+      <w:r>
+        <w:rPr>
+          <w:color w:val="CCD9F0"/>
+        </w:rPr>
+        <w:t xml:space="preserve"> fonc</w:t>
+      </w:r>
+      <w:r>
+        <w:rPr>
+          <w:color w:val="CCD9F0"/>
+        </w:rPr>
+        <w:t>é</w:t>
+      </w:r>
+      <w:r>
+        <w:rPr>
+          <w:color w:val="002060"/>
+        </w:rPr>
+        <w:t> </w:t>
+      </w:r>
+      <w:r>
+        <w:t xml:space="preserve">: </w:t>
+      </w:r>
+      <w:r>
+        <w:t>#3F5069</w:t>
+      </w:r>
+    </w:p>
+    <w:p>
+      <w:pPr>
+        <w:pStyle w:val="Studys"/>
+      </w:pPr>
+      <w:r>
+        <w:rPr>
+          <w:color w:val="0D0D0D"/>
+        </w:rPr>
+        <w:t>Noir </w:t>
+      </w:r>
+      <w:r>
+        <w:t xml:space="preserve">: </w:t>
       </w:r>
       <w:r>
         <w:t>#0D0D0D</w:t>
@@ -177,18 +463,124 @@
         <w:pStyle w:val="Studys"/>
       </w:pPr>
       <w:r>
-        <w:t>5. Typographie</w:t>
-      </w:r>
-    </w:p>
-    <w:p>
-      <w:pPr>
-        <w:pStyle w:val="Studys"/>
-      </w:pPr>
-      <w:r>
-        <w:t>Police :</w:t>
-      </w:r>
-      <w:r>
-        <w:t>Open sans</w:t>
+        <w:lastRenderedPageBreak/>
+        <w:t xml:space="preserve">Le mode clair </w:t>
+      </w:r>
+      <w:r>
+        <w:t xml:space="preserve">privilégiera un fond lumineux afin de faciliter la lecture dans un environnement bien éclairé. Le mode sombre proposera une interface plus sombre, adapté aux préférences de chaque </w:t>
+      </w:r>
+      <w:proofErr w:type="gramStart"/>
+      <w:r>
+        <w:t>utilisateurs</w:t>
+      </w:r>
+      <w:proofErr w:type="gramEnd"/>
+      <w:r>
+        <w:t xml:space="preserve"> </w:t>
+      </w:r>
+    </w:p>
+    <w:p>
+      <w:pPr>
+        <w:pStyle w:val="Studys"/>
+      </w:pPr>
+      <w:r>
+        <w:t>6.</w:t>
+      </w:r>
+      <w:r>
+        <w:rPr>
+          <w:i/>
+          <w:iCs/>
+        </w:rPr>
+        <w:t>Signification des couleurs</w:t>
+      </w:r>
+      <w:r>
+        <w:t> :</w:t>
+      </w:r>
+    </w:p>
+    <w:p>
+      <w:pPr>
+        <w:pStyle w:val="Studys"/>
+      </w:pPr>
+      <w:r>
+        <w:t xml:space="preserve">Bleu : </w:t>
+      </w:r>
+      <w:r>
+        <w:t xml:space="preserve">symbolise la confiance, la fiabilité et le professionnalisme. Il sera utilisé principalement </w:t>
+      </w:r>
+      <w:r>
+        <w:t>pour mettre en valeur les éléments importants de l’interface.</w:t>
+      </w:r>
+    </w:p>
+    <w:p>
+      <w:pPr>
+        <w:pStyle w:val="Studys"/>
+      </w:pPr>
+      <w:r>
+        <w:t xml:space="preserve">Blanc : Cette couleur </w:t>
+      </w:r>
+      <w:r>
+        <w:t>apportera de la clarté et améliora la lisibilité des contenus en mode clair</w:t>
+      </w:r>
+      <w:r>
+        <w:t xml:space="preserve"> </w:t>
+      </w:r>
+    </w:p>
+    <w:p>
+      <w:pPr>
+        <w:pStyle w:val="Studys"/>
+      </w:pPr>
+      <w:r>
+        <w:t xml:space="preserve">Bleu foncé : </w:t>
+      </w:r>
+      <w:r>
+        <w:t xml:space="preserve">Renforce l’impression de sérieux et permet de différencier certains éléments en mode sombre </w:t>
+      </w:r>
+    </w:p>
+    <w:p>
+      <w:pPr>
+        <w:pStyle w:val="Studys"/>
+      </w:pPr>
+      <w:r>
+        <w:t>Noir : Elle donne une apparence moderne et élégante au portfolio</w:t>
+      </w:r>
+    </w:p>
+    <w:p>
+      <w:pPr>
+        <w:pStyle w:val="Studys"/>
+      </w:pPr>
+      <w:r>
+        <w:t>7</w:t>
+      </w:r>
+      <w:r>
+        <w:t xml:space="preserve">. </w:t>
+      </w:r>
+      <w:r>
+        <w:rPr>
+          <w:i/>
+          <w:iCs/>
+        </w:rPr>
+        <w:t>Typographie</w:t>
+      </w:r>
+    </w:p>
+    <w:p>
+      <w:pPr>
+        <w:pStyle w:val="Studys"/>
+      </w:pPr>
+      <w:r>
+        <w:t>Police</w:t>
+      </w:r>
+      <w:r>
+        <w:t xml:space="preserve"> Principal</w:t>
+      </w:r>
+      <w:proofErr w:type="gramStart"/>
+      <w:r>
+        <w:t> :</w:t>
+      </w:r>
+      <w:r>
+        <w:t>Open</w:t>
+      </w:r>
+      <w:proofErr w:type="gramEnd"/>
+      <w:r>
+        <w:t xml:space="preserve"> sans</w:t>
       </w:r>
       <w:r>
         <w:t> </w:t>
@@ -199,9 +591,291 @@
         <w:pStyle w:val="Studys"/>
       </w:pPr>
       <w:r>
+        <w:t>Lien vers la police :</w:t>
+      </w:r>
+    </w:p>
+    <w:p>
+      <w:pPr>
+        <w:pStyle w:val="Studys"/>
+      </w:pPr>
+      <w:hyperlink r:id="rId5" w:history="1">
+        <w:r>
+          <w:rPr>
+            <w:rStyle w:val="Lienhypertexte"/>
+          </w:rPr>
+          <w:t>https://fonts.google.com/specimen/Open+Sans?lang=fr_Latn&amp;preview.lang=fr_Latn</w:t>
+        </w:r>
+      </w:hyperlink>
+    </w:p>
+    <w:p>
+      <w:pPr>
+        <w:pStyle w:val="Studys"/>
+      </w:pPr>
+      <w:r>
         <w:lastRenderedPageBreak/>
-        <w:t>https://fonts.google.com/specimen/Open+Sans?lang=fr_Latn&amp;preview.lang=fr_Latn</w:t>
-      </w:r>
+        <w:t>La police Open sans a</w:t>
+      </w:r>
+      <w:r>
+        <w:t xml:space="preserve"> été choisi pour sa simplicité et sa lisibilité</w:t>
+      </w:r>
+      <w:r>
+        <w:t>. Elle permet une lecture confortable sur écran en apportant une apparence moderne et professionnelle.</w:t>
+      </w:r>
+    </w:p>
+    <w:p>
+      <w:pPr>
+        <w:pStyle w:val="Studys"/>
+      </w:pPr>
+      <w:r>
+        <w:t xml:space="preserve">Elle sera </w:t>
+      </w:r>
+      <w:proofErr w:type="gramStart"/>
+      <w:r>
+        <w:t>utilisé</w:t>
+      </w:r>
+      <w:proofErr w:type="gramEnd"/>
+      <w:r>
+        <w:t xml:space="preserve"> pour les titres, paragraphes, les menus de navigation et les boutons.</w:t>
+      </w:r>
+    </w:p>
+    <w:p>
+      <w:pPr>
+        <w:pStyle w:val="Studys"/>
+      </w:pPr>
+      <w:r>
+        <w:t>Hiérarchie typographique</w:t>
+      </w:r>
+      <w:r>
+        <w:t> :</w:t>
+      </w:r>
+    </w:p>
+    <w:p>
+      <w:pPr>
+        <w:pStyle w:val="Studys"/>
+      </w:pPr>
+      <w:r>
+        <w:t xml:space="preserve">Taille du titre principal : </w:t>
+      </w:r>
+      <w:r>
+        <w:t>36 à 48 px, gras.</w:t>
+      </w:r>
+    </w:p>
+    <w:p>
+      <w:pPr>
+        <w:pStyle w:val="Studys"/>
+      </w:pPr>
+      <w:r>
+        <w:t xml:space="preserve"> Titres de sections : 24 à 32 px, semi-gras.</w:t>
+      </w:r>
+    </w:p>
+    <w:p>
+      <w:pPr>
+        <w:pStyle w:val="Studys"/>
+      </w:pPr>
+      <w:r>
+        <w:t xml:space="preserve">Texte : </w:t>
+      </w:r>
+      <w:r>
+        <w:t>Texte courant : 16 à 18 px.</w:t>
+      </w:r>
+    </w:p>
+    <w:p>
+      <w:pPr>
+        <w:pStyle w:val="Studys"/>
+      </w:pPr>
+      <w:r>
+        <w:t xml:space="preserve">Cette hiérarchie permettra de distinguer clairement les </w:t>
+      </w:r>
+      <w:proofErr w:type="spellStart"/>
+      <w:r>
+        <w:t>differente</w:t>
+      </w:r>
+      <w:proofErr w:type="spellEnd"/>
+      <w:r>
+        <w:t xml:space="preserve"> parties du portfolio et de faciliter la lecture des informations</w:t>
+      </w:r>
+    </w:p>
+    <w:p>
+      <w:pPr>
+        <w:pStyle w:val="Studys"/>
+      </w:pPr>
+      <w:r>
+        <w:t xml:space="preserve"> </w:t>
+      </w:r>
+    </w:p>
+    <w:p>
+      <w:pPr>
+        <w:pStyle w:val="Studys"/>
+      </w:pPr>
+      <w:r>
+        <w:t xml:space="preserve">8. </w:t>
+      </w:r>
+      <w:r>
+        <w:rPr>
+          <w:i/>
+          <w:iCs/>
+        </w:rPr>
+        <w:t>Icônes et illustrations</w:t>
+      </w:r>
+      <w:r>
+        <w:t xml:space="preserve"> </w:t>
+      </w:r>
+    </w:p>
+    <w:p>
+      <w:pPr>
+        <w:pStyle w:val="Studys"/>
+      </w:pPr>
+      <w:r>
+        <w:t xml:space="preserve">Les icônes utilisées sur le portfolio seront simples et cohérentes afin de conserver </w:t>
+      </w:r>
+      <w:r>
+        <w:t xml:space="preserve">une </w:t>
+      </w:r>
+      <w:r>
+        <w:t xml:space="preserve">unité graphique </w:t>
+      </w:r>
+      <w:r>
+        <w:t>homogène.</w:t>
+      </w:r>
+    </w:p>
+    <w:p>
+      <w:pPr>
+        <w:pStyle w:val="Studys"/>
+      </w:pPr>
+      <w:r>
+        <w:t xml:space="preserve">Elles représenteront notamment : </w:t>
+      </w:r>
+    </w:p>
+    <w:p>
+      <w:pPr>
+        <w:pStyle w:val="Studys"/>
+      </w:pPr>
+      <w:r>
+        <w:t xml:space="preserve">Les compétences </w:t>
+      </w:r>
+    </w:p>
+    <w:p>
+      <w:pPr>
+        <w:pStyle w:val="Studys"/>
+      </w:pPr>
+      <w:r>
+        <w:t xml:space="preserve">Les projets </w:t>
+      </w:r>
+      <w:r>
+        <w:t>réalisés</w:t>
+      </w:r>
+    </w:p>
+    <w:p>
+      <w:pPr>
+        <w:pStyle w:val="Studys"/>
+      </w:pPr>
+      <w:r>
+        <w:t xml:space="preserve">Les formations </w:t>
+      </w:r>
+    </w:p>
+    <w:p>
+      <w:pPr>
+        <w:pStyle w:val="Studys"/>
+      </w:pPr>
+      <w:r>
+        <w:lastRenderedPageBreak/>
+        <w:t>Les</w:t>
+      </w:r>
+      <w:r>
+        <w:t xml:space="preserve"> moyens de</w:t>
+      </w:r>
+      <w:r>
+        <w:t xml:space="preserve"> contacts</w:t>
+      </w:r>
+    </w:p>
+    <w:p>
+      <w:pPr>
+        <w:pStyle w:val="Studys"/>
+      </w:pPr>
+      <w:r>
+        <w:t xml:space="preserve">Les illustrations seront </w:t>
+      </w:r>
+      <w:r>
+        <w:t>limitées</w:t>
+      </w:r>
+      <w:r>
+        <w:t xml:space="preserve"> </w:t>
+      </w:r>
+      <w:r>
+        <w:t>aux établissements scolaires</w:t>
+      </w:r>
+      <w:r>
+        <w:t xml:space="preserve"> et </w:t>
+      </w:r>
+      <w:r>
+        <w:t>aux entreprises</w:t>
+      </w:r>
+      <w:r>
+        <w:t xml:space="preserve"> afin de privilégier la lisibilité du site </w:t>
+      </w:r>
+      <w:r>
+        <w:t>et ne pas surcharg</w:t>
+      </w:r>
+      <w:r>
+        <w:t>er l’interface.</w:t>
+      </w:r>
+    </w:p>
+    <w:p>
+      <w:pPr>
+        <w:pStyle w:val="Studys"/>
+      </w:pPr>
+      <w:r>
+        <w:t xml:space="preserve">9. </w:t>
+      </w:r>
+      <w:r>
+        <w:rPr>
+          <w:i/>
+          <w:iCs/>
+        </w:rPr>
+        <w:t>Navigation et composants graphique</w:t>
+      </w:r>
+      <w:r>
+        <w:t xml:space="preserve"> </w:t>
+      </w:r>
+    </w:p>
+    <w:p>
+      <w:pPr>
+        <w:pStyle w:val="Studys"/>
+      </w:pPr>
+      <w:r>
+        <w:t>La barre de navigation comportera un indicateur visuel sous la section active. Cet indicateur prendra la forme d’un trait blanc afin de permettre à l’utilisateur de repérer facilement la section consultée.</w:t>
+      </w:r>
+    </w:p>
+    <w:p>
+      <w:pPr>
+        <w:pStyle w:val="Studys"/>
+      </w:pPr>
+      <w:r>
+        <w:t>Les éléments de l’interface, notamment les boutons, les cartes de projets er conteneurs, utiliseront des bords arrondis. Ce choix permettra de créer une apparence moderne et cohérente.</w:t>
+      </w:r>
+    </w:p>
+    <w:p>
+      <w:pPr>
+        <w:pStyle w:val="Studys"/>
+      </w:pPr>
+    </w:p>
+    <w:p>
+      <w:pPr>
+        <w:pStyle w:val="Studys"/>
+      </w:pPr>
+    </w:p>
+    <w:p>
+      <w:pPr>
+        <w:pStyle w:val="Studys"/>
+      </w:pPr>
+      <w:r>
+        <w:t xml:space="preserve"> </w:t>
+      </w:r>
+    </w:p>
+    <w:p>
+      <w:pPr>
+        <w:pStyle w:val="Studys"/>
+      </w:pPr>
     </w:p>
     <w:p>
       <w:pPr>
@@ -216,6 +890,195 @@
     </w:sectPr>
   </w:body>
 </w:document>
+</file>
+
+<file path=word/numbering.xml><?xml version="1.0" encoding="utf-8"?>
+<w:numbering xmlns:wpc="http://schemas.microsoft.com/office/word/2010/wordprocessingCanvas" xmlns:cx="http://schemas.microsoft.com/office/drawing/2014/chartex" xmlns:cx1="http://schemas.microsoft.com/office/drawing/2015/9/8/chartex" xmlns:cx2="http://schemas.microsoft.com/office/drawing/2015/10/21/chartex" xmlns:cx3="http://schemas.microsoft.com/office/drawing/2016/5/9/chartex" xmlns:cx4="http://schemas.microsoft.com/office/drawing/2016/5/10/chartex" xmlns:cx5="http://schemas.microsoft.com/office/drawing/2016/5/11/chartex" xmlns:cx6="http://schemas.microsoft.com/office/drawing/2016/5/12/chartex" xmlns:cx7="http://schemas.microsoft.com/office/drawing/2016/5/13/chartex" xmlns:cx8="http://schemas.microsoft.com/office/drawing/2016/5/14/chartex" xmlns:mc="http://schemas.openxmlformats.org/markup-compatibility/2006" xmlns:aink="http://schemas.microsoft.com/office/drawing/2016/ink" xmlns:am3d="http://schemas.microsoft.com/office/drawing/2017/model3d" xmlns:o="urn:schemas-microsoft-com:office:office" xmlns:oel="http://schemas.microsoft.com/office/2019/extlst" xmlns:r="http://schemas.openxmlformats.org/officeDocument/2006/relationships" xmlns:m="http://schemas.openxmlformats.org/officeDocument/2006/math" xmlns:v="urn:schemas-microsoft-com:vml" xmlns:wp14="http://schemas.microsoft.com/office/word/2010/wordprocessingDrawing" xmlns:wp="http://schemas.openxmlformats.org/drawingml/2006/wordprocessingDrawing" xmlns:w10="urn:schemas-microsoft-com:office:word" xmlns:w="http://schemas.openxmlformats.org/wordprocessingml/2006/main" xmlns:w14="http://schemas.microsoft.com/office/word/2010/wordml" xmlns:w15="http://schemas.microsoft.com/office/word/2012/wordml" xmlns:w16cex="http://schemas.microsoft.com/office/word/2018/wordml/cex" xmlns:w16cid="http://schemas.microsoft.com/office/word/2016/wordml/cid" xmlns:w16="http://schemas.microsoft.com/office/word/2018/wordml" xmlns:w16du="http://schemas.microsoft.com/office/word/2023/wordml/word16du" xmlns:w16sdtdh="http://schemas.microsoft.com/office/word/2020/wordml/sdtdatahash" xmlns:w16sdtfl="http://schemas.microsoft.com/office/word/2024/wordml/sdtformatlock" xmlns:w16se="http://schemas.microsoft.com/office/word/2015/wordml/symex" xmlns:wpg="http://schemas.microsoft.com/office/word/2010/wordprocessingGroup" xmlns:wpi="http://schemas.microsoft.com/office/word/2010/wordprocessingInk" xmlns:wne="http://schemas.microsoft.com/office/word/2006/wordml" xmlns:wps="http://schemas.microsoft.com/office/word/2010/wordprocessingShape" mc:Ignorable="w14 w15 w16se w16cid w16 w16cex w16sdtdh w16sdtfl w16du wp14">
+  <w:abstractNum w:abstractNumId="0" w15:restartNumberingAfterBreak="0">
+    <w:nsid w:val="26B82CF9"/>
+    <w:multiLevelType w:val="hybridMultilevel"/>
+    <w:tmpl w:val="68E20F20"/>
+    <w:lvl w:ilvl="0" w:tplc="040C000F">
+      <w:start w:val="1"/>
+      <w:numFmt w:val="decimal"/>
+      <w:lvlText w:val="%1."/>
+      <w:lvlJc w:val="left"/>
+      <w:pPr>
+        <w:ind w:left="720" w:hanging="360"/>
+      </w:pPr>
+      <w:rPr>
+        <w:rFonts w:hint="default"/>
+      </w:rPr>
+    </w:lvl>
+    <w:lvl w:ilvl="1" w:tplc="040C0019" w:tentative="1">
+      <w:start w:val="1"/>
+      <w:numFmt w:val="lowerLetter"/>
+      <w:lvlText w:val="%2."/>
+      <w:lvlJc w:val="left"/>
+      <w:pPr>
+        <w:ind w:left="1440" w:hanging="360"/>
+      </w:pPr>
+    </w:lvl>
+    <w:lvl w:ilvl="2" w:tplc="040C001B" w:tentative="1">
+      <w:start w:val="1"/>
+      <w:numFmt w:val="lowerRoman"/>
+      <w:lvlText w:val="%3."/>
+      <w:lvlJc w:val="right"/>
+      <w:pPr>
+        <w:ind w:left="2160" w:hanging="180"/>
+      </w:pPr>
+    </w:lvl>
+    <w:lvl w:ilvl="3" w:tplc="040C000F" w:tentative="1">
+      <w:start w:val="1"/>
+      <w:numFmt w:val="decimal"/>
+      <w:lvlText w:val="%4."/>
+      <w:lvlJc w:val="left"/>
+      <w:pPr>
+        <w:ind w:left="2880" w:hanging="360"/>
+      </w:pPr>
+    </w:lvl>
+    <w:lvl w:ilvl="4" w:tplc="040C0019" w:tentative="1">
+      <w:start w:val="1"/>
+      <w:numFmt w:val="lowerLetter"/>
+      <w:lvlText w:val="%5."/>
+      <w:lvlJc w:val="left"/>
+      <w:pPr>
+        <w:ind w:left="3600" w:hanging="360"/>
+      </w:pPr>
+    </w:lvl>
+    <w:lvl w:ilvl="5" w:tplc="040C001B" w:tentative="1">
+      <w:start w:val="1"/>
+      <w:numFmt w:val="lowerRoman"/>
+      <w:lvlText w:val="%6."/>
+      <w:lvlJc w:val="right"/>
+      <w:pPr>
+        <w:ind w:left="4320" w:hanging="180"/>
+      </w:pPr>
+    </w:lvl>
+    <w:lvl w:ilvl="6" w:tplc="040C000F" w:tentative="1">
+      <w:start w:val="1"/>
+      <w:numFmt w:val="decimal"/>
+      <w:lvlText w:val="%7."/>
+      <w:lvlJc w:val="left"/>
+      <w:pPr>
+        <w:ind w:left="5040" w:hanging="360"/>
+      </w:pPr>
+    </w:lvl>
+    <w:lvl w:ilvl="7" w:tplc="040C0019" w:tentative="1">
+      <w:start w:val="1"/>
+      <w:numFmt w:val="lowerLetter"/>
+      <w:lvlText w:val="%8."/>
+      <w:lvlJc w:val="left"/>
+      <w:pPr>
+        <w:ind w:left="5760" w:hanging="360"/>
+      </w:pPr>
+    </w:lvl>
+    <w:lvl w:ilvl="8" w:tplc="040C001B" w:tentative="1">
+      <w:start w:val="1"/>
+      <w:numFmt w:val="lowerRoman"/>
+      <w:lvlText w:val="%9."/>
+      <w:lvlJc w:val="right"/>
+      <w:pPr>
+        <w:ind w:left="6480" w:hanging="180"/>
+      </w:pPr>
+    </w:lvl>
+  </w:abstractNum>
+  <w:abstractNum w:abstractNumId="1" w15:restartNumberingAfterBreak="0">
+    <w:nsid w:val="739161A9"/>
+    <w:multiLevelType w:val="hybridMultilevel"/>
+    <w:tmpl w:val="E172652E"/>
+    <w:lvl w:ilvl="0" w:tplc="040C000F">
+      <w:start w:val="5"/>
+      <w:numFmt w:val="decimal"/>
+      <w:lvlText w:val="%1."/>
+      <w:lvlJc w:val="left"/>
+      <w:pPr>
+        <w:ind w:left="720" w:hanging="360"/>
+      </w:pPr>
+      <w:rPr>
+        <w:rFonts w:hint="default"/>
+      </w:rPr>
+    </w:lvl>
+    <w:lvl w:ilvl="1" w:tplc="040C0019" w:tentative="1">
+      <w:start w:val="1"/>
+      <w:numFmt w:val="lowerLetter"/>
+      <w:lvlText w:val="%2."/>
+      <w:lvlJc w:val="left"/>
+      <w:pPr>
+        <w:ind w:left="1440" w:hanging="360"/>
+      </w:pPr>
+    </w:lvl>
+    <w:lvl w:ilvl="2" w:tplc="040C001B" w:tentative="1">
+      <w:start w:val="1"/>
+      <w:numFmt w:val="lowerRoman"/>
+      <w:lvlText w:val="%3."/>
+      <w:lvlJc w:val="right"/>
+      <w:pPr>
+        <w:ind w:left="2160" w:hanging="180"/>
+      </w:pPr>
+    </w:lvl>
+    <w:lvl w:ilvl="3" w:tplc="040C000F" w:tentative="1">
+      <w:start w:val="1"/>
+      <w:numFmt w:val="decimal"/>
+      <w:lvlText w:val="%4."/>
+      <w:lvlJc w:val="left"/>
+      <w:pPr>
+        <w:ind w:left="2880" w:hanging="360"/>
+      </w:pPr>
+    </w:lvl>
+    <w:lvl w:ilvl="4" w:tplc="040C0019" w:tentative="1">
+      <w:start w:val="1"/>
+      <w:numFmt w:val="lowerLetter"/>
+      <w:lvlText w:val="%5."/>
+      <w:lvlJc w:val="left"/>
+      <w:pPr>
+        <w:ind w:left="3600" w:hanging="360"/>
+      </w:pPr>
+    </w:lvl>
+    <w:lvl w:ilvl="5" w:tplc="040C001B" w:tentative="1">
+      <w:start w:val="1"/>
+      <w:numFmt w:val="lowerRoman"/>
+      <w:lvlText w:val="%6."/>
+      <w:lvlJc w:val="right"/>
+      <w:pPr>
+        <w:ind w:left="4320" w:hanging="180"/>
+      </w:pPr>
+    </w:lvl>
+    <w:lvl w:ilvl="6" w:tplc="040C000F" w:tentative="1">
+      <w:start w:val="1"/>
+      <w:numFmt w:val="decimal"/>
+      <w:lvlText w:val="%7."/>
+      <w:lvlJc w:val="left"/>
+      <w:pPr>
+        <w:ind w:left="5040" w:hanging="360"/>
+      </w:pPr>
+    </w:lvl>
+    <w:lvl w:ilvl="7" w:tplc="040C0019" w:tentative="1">
+      <w:start w:val="1"/>
+      <w:numFmt w:val="lowerLetter"/>
+      <w:lvlText w:val="%8."/>
+      <w:lvlJc w:val="left"/>
+      <w:pPr>
+        <w:ind w:left="5760" w:hanging="360"/>
+      </w:pPr>
+    </w:lvl>
+    <w:lvl w:ilvl="8" w:tplc="040C001B" w:tentative="1">
+      <w:start w:val="1"/>
+      <w:numFmt w:val="lowerRoman"/>
+      <w:lvlText w:val="%9."/>
+      <w:lvlJc w:val="right"/>
+      <w:pPr>
+        <w:ind w:left="6480" w:hanging="180"/>
+      </w:pPr>
+    </w:lvl>
+  </w:abstractNum>
+  <w:num w:numId="1" w16cid:durableId="801264696">
+    <w:abstractNumId w:val="0"/>
+  </w:num>
+  <w:num w:numId="2" w16cid:durableId="1989552656">
+    <w:abstractNumId w:val="1"/>
+  </w:num>
+</w:numbering>
 </file>
 
 <file path=word/styles.xml><?xml version="1.0" encoding="utf-8"?>
@@ -822,7 +1685,6 @@
   <w:style w:type="character" w:default="1" w:styleId="Policepardfaut">
     <w:name w:val="Default Paragraph Font"/>
     <w:uiPriority w:val="1"/>
-    <w:semiHidden/>
     <w:unhideWhenUsed/>
   </w:style>
   <w:style w:type="table" w:default="1" w:styleId="TableauNormal">
@@ -1161,6 +2023,29 @@
       <w:rFonts w:ascii="Arial" w:hAnsi="Arial" w:cs="Arial"/>
       <w:color w:val="000000"/>
       <w:sz w:val="28"/>
+    </w:rPr>
+  </w:style>
+  <w:style w:type="character" w:styleId="Lienhypertexte">
+    <w:name w:val="Hyperlink"/>
+    <w:basedOn w:val="Policepardfaut"/>
+    <w:uiPriority w:val="99"/>
+    <w:unhideWhenUsed/>
+    <w:rsid w:val="0023698A"/>
+    <w:rPr>
+      <w:color w:val="467886" w:themeColor="hyperlink"/>
+      <w:u w:val="single"/>
+    </w:rPr>
+  </w:style>
+  <w:style w:type="character" w:styleId="Mentionnonrsolue">
+    <w:name w:val="Unresolved Mention"/>
+    <w:basedOn w:val="Policepardfaut"/>
+    <w:uiPriority w:val="99"/>
+    <w:semiHidden/>
+    <w:unhideWhenUsed/>
+    <w:rsid w:val="0023698A"/>
+    <w:rPr>
+      <w:color w:val="605E5C"/>
+      <w:shd w:val="clear" w:color="auto" w:fill="E1DFDD"/>
     </w:rPr>
   </w:style>
 </w:styles>

</xml_diff>